<commit_message>
SVA: Journal-Eintrag fürs Protokoll kopieren – Kommentar bleibt, Dauer in Minuten, Schrift des Dossiers; Rettungsvorlage mit Grundschrift Calibri
Co-Authored-By: Claude Opus 5.5 <noreply@anthropic.com>
</commit_message>
<xml_diff>
--- a/sva/SVA-Dossier-Vorlage.docx
+++ b/sva/SVA-Dossier-Vorlage.docx
@@ -1607,7 +1607,7 @@
         <w:ind w:left="720" w:hanging="360"/>
       </w:pPr>
       <w:rPr>
-        <w:rFonts w:ascii="Arial" w:eastAsia="Times New Roman" w:hAnsi="Arial" w:cs="Arial" w:hint="default"/>
+        <w:rFonts w:ascii="Calibri" w:eastAsia="Times New Roman" w:hAnsi="Calibri" w:cs="Calibri" w:hint="default"/>
       </w:rPr>
     </w:lvl>
     <w:lvl w:ilvl="1" w:tplc="04070003" w:tentative="1">
@@ -1886,7 +1886,7 @@
         <w:ind w:left="720" w:hanging="360"/>
       </w:pPr>
       <w:rPr>
-        <w:rFonts w:ascii="Arial" w:eastAsia="Times New Roman" w:hAnsi="Arial" w:cs="Arial" w:hint="default"/>
+        <w:rFonts w:ascii="Calibri" w:eastAsia="Times New Roman" w:hAnsi="Calibri" w:cs="Calibri" w:hint="default"/>
       </w:rPr>
     </w:lvl>
     <w:lvl w:ilvl="1" w:tplc="04070003" w:tentative="1">
@@ -2396,7 +2396,7 @@
   <w:docDefaults>
     <w:rPrDefault>
       <w:rPr>
-        <w:rFonts w:ascii="Times New Roman" w:eastAsia="Times New Roman" w:hAnsi="Times New Roman" w:cs="Times New Roman"/>
+        <w:rFonts w:ascii="Calibri" w:eastAsia="Calibri" w:hAnsi="Calibri" w:cs="Calibri"/>
         <w:lang w:val="de-CH" w:eastAsia="de-CH" w:bidi="ar-SA"/>
       </w:rPr>
     </w:rPrDefault>
@@ -2694,6 +2694,7 @@
       <w:jc w:val="both"/>
     </w:pPr>
     <w:rPr>
+      <w:rFonts w:ascii="Calibri" w:hAnsi="Calibri" w:cs="Calibri"/>
       <w:sz w:val="24"/>
       <w:szCs w:val="24"/>
       <w:lang w:eastAsia="de-DE"/>

</xml_diff>

<commit_message>
SVA: Journal-Eintrag fürs Protokoll kommt linksbündig und in der Schrift des Dossiers in Word an (formatierte Zwischenablage), Rettungsvorlage: Protokoll-Tabellen linksbündig
Co-Authored-By: Claude Opus 5.5 <noreply@anthropic.com>
</commit_message>
<xml_diff>
--- a/sva/SVA-Dossier-Vorlage.docx
+++ b/sva/SVA-Dossier-Vorlage.docx
@@ -338,7 +338,9 @@
             <w:vMerge/>
           </w:tcPr>
           <w:p>
-            <w:pPr/>
+            <w:pPr>
+              <w:jc w:val="left"/>
+            </w:pPr>
           </w:p>
         </w:tc>
         <w:tc>
@@ -359,7 +361,9 @@
             </w:r>
           </w:p>
           <w:p>
-            <w:pPr/>
+            <w:pPr>
+              <w:jc w:val="left"/>
+            </w:pPr>
             <w:r>
               <w:rPr>
                 <w:rFonts w:ascii="Calibri" w:hAnsi="Calibri" w:cs="Calibri"/>
@@ -369,7 +373,9 @@
             </w:r>
           </w:p>
           <w:p>
-            <w:pPr/>
+            <w:pPr>
+              <w:jc w:val="left"/>
+            </w:pPr>
             <w:r>
               <w:rPr>
                 <w:rFonts w:ascii="Calibri" w:hAnsi="Calibri" w:cs="Calibri"/>
@@ -452,7 +458,9 @@
             <w:vMerge/>
           </w:tcPr>
           <w:p>
-            <w:pPr/>
+            <w:pPr>
+              <w:jc w:val="left"/>
+            </w:pPr>
           </w:p>
         </w:tc>
         <w:tc>
@@ -473,7 +481,9 @@
             </w:r>
           </w:p>
           <w:p>
-            <w:pPr/>
+            <w:pPr>
+              <w:jc w:val="left"/>
+            </w:pPr>
             <w:r>
               <w:rPr>
                 <w:rFonts w:ascii="Calibri" w:hAnsi="Calibri" w:cs="Calibri"/>
@@ -483,7 +493,9 @@
             </w:r>
           </w:p>
           <w:p>
-            <w:pPr/>
+            <w:pPr>
+              <w:jc w:val="left"/>
+            </w:pPr>
             <w:r>
               <w:rPr>
                 <w:rFonts w:ascii="Calibri" w:hAnsi="Calibri" w:cs="Calibri"/>

</xml_diff>